<commit_message>
atualizacao evidencia de teste
</commit_message>
<xml_diff>
--- a/evidencia/evidencia de teste.docx
+++ b/evidencia/evidencia de teste.docx
@@ -3,6 +3,9 @@
 <w:document xmlns:wpc="http://schemas.microsoft.com/office/word/2010/wordprocessingCanvas" xmlns:mc="http://schemas.openxmlformats.org/markup-compatibility/2006" xmlns:o="urn:schemas-microsoft-com:office:office" xmlns:r="http://schemas.openxmlformats.org/officeDocument/2006/relationships" xmlns:m="http://schemas.openxmlformats.org/officeDocument/2006/math" xmlns:v="urn:schemas-microsoft-com:vml" xmlns:wp14="http://schemas.microsoft.com/office/word/2010/wordprocessingDrawing" xmlns:wp="http://schemas.openxmlformats.org/drawingml/2006/wordprocessingDrawing" xmlns:w10="urn:schemas-microsoft-com:office:word" xmlns:w="http://schemas.openxmlformats.org/wordprocessingml/2006/main" xmlns:w14="http://schemas.microsoft.com/office/word/2010/wordml" xmlns:wpg="http://schemas.microsoft.com/office/word/2010/wordprocessingGroup" xmlns:wpi="http://schemas.microsoft.com/office/word/2010/wordprocessingInk" xmlns:wne="http://schemas.microsoft.com/office/word/2006/wordml" xmlns:wps="http://schemas.microsoft.com/office/word/2010/wordprocessingShape" mc:Ignorable="w14 wp14">
   <w:body>
     <w:p>
+      <w:pPr>
+        <w:pStyle w:val="Ttulo1"/>
+      </w:pPr>
       <w:r>
         <w:t>Evidências de testes do projeto Gerenciamento de Produtos</w:t>
       </w:r>
@@ -30,6 +33,10 @@
     </w:p>
     <w:p>
       <w:r>
+        <w:rPr>
+          <w:noProof/>
+          <w:lang w:eastAsia="pt-BR"/>
+        </w:rPr>
         <w:drawing>
           <wp:inline distT="0" distB="0" distL="0" distR="0" wp14:anchorId="6097E6AC" wp14:editId="772262B7">
             <wp:extent cx="5400040" cy="1743801"/>
@@ -82,6 +89,10 @@
     </w:p>
     <w:p>
       <w:r>
+        <w:rPr>
+          <w:noProof/>
+          <w:lang w:eastAsia="pt-BR"/>
+        </w:rPr>
         <w:drawing>
           <wp:inline distT="0" distB="0" distL="0" distR="0" wp14:anchorId="6FE55D12" wp14:editId="44F5E02E">
             <wp:extent cx="5400040" cy="3470494"/>
@@ -134,39 +145,32 @@
     </w:p>
     <w:p>
       <w:r>
-        <w:t>Token</w:t>
+        <w:t xml:space="preserve">Usar o </w:t>
+      </w:r>
+      <w:proofErr w:type="spellStart"/>
+      <w:r>
+        <w:t>token</w:t>
+      </w:r>
+      <w:proofErr w:type="spellEnd"/>
+      <w:r>
+        <w:t xml:space="preserve"> gerado no </w:t>
+      </w:r>
+      <w:proofErr w:type="spellStart"/>
+      <w:r>
+        <w:t>login</w:t>
+      </w:r>
+      <w:proofErr w:type="spellEnd"/>
+      <w:r>
+        <w:t xml:space="preserve"> do usuário comum.</w:t>
       </w:r>
     </w:p>
-    <w:tbl>
-      <w:tblPr>
-        <w:tblStyle w:val="Tabelacomgrade"/>
-        <w:tblW w:w="0" w:type="auto"/>
-        <w:tblLook w:val="04A0" w:firstRow="1" w:lastRow="0" w:firstColumn="1" w:lastColumn="0" w:noHBand="0" w:noVBand="1"/>
-      </w:tblPr>
-      <w:tblGrid>
-        <w:gridCol w:w="8720"/>
-      </w:tblGrid>
-      <w:tr>
-        <w:tc>
-          <w:tcPr>
-            <w:tcW w:w="8644" w:type="dxa"/>
-          </w:tcPr>
-          <w:p>
-            <w:proofErr w:type="gramStart"/>
-            <w:r>
-              <w:t>eyJ0eXAiOiJKV1QiLCJhbGciOiJSUzI1NiJ9</w:t>
-            </w:r>
-            <w:proofErr w:type="gramEnd"/>
-            <w:r>
-              <w:t>.eyJzdWIiOiIyIiwiZ3JvdXBzIjpbIlVTRVIiXSwiaXNzIjoiaHR0cHM6Ly9zaG9waS5jb20vaXNzdWVyIiwiaWF0IjoxNzc5NzU3NDMxLCJleHAiOjE3Nzk3NjEwMzEsImp0aSI6ImNlMjNiODIwLTc1M2QtNDk1Mi05NDk3LWMwMWE1NzdlYzMzZiJ9.tyU47EI49cY6-4WOhbP_uyE1sAmZ4vsK7ium1s5OLZKvz7bBgRUTRnEqo3-QMPVKlEaaIZDDjNh3iohlJnryedCKOuw16ctwxMEIxsL7lV7Mcrf2tEftkAt8pvUkFHMsyxnWtvSurBc0AiSZminuXT6QIrUGepSw-NH_7n7d2cHQuOKnbuJtbEp1nlBlvKECC4qCPL1up6K-R75eljIsh9c0quwfU_2R07g8JUHZhPeGj_m4KcdmEuqhFFH36rZ648X-udl3NYRTwxU6x0hngAJHCbR4SrLkMrmNt5CGVbGjSCKmq3H7Z7iMhUAfujsBFPAP6r4C6rOniKcyxZ43rw</w:t>
-            </w:r>
-          </w:p>
-        </w:tc>
-      </w:tr>
-    </w:tbl>
     <w:p/>
     <w:p>
       <w:r>
+        <w:rPr>
+          <w:noProof/>
+          <w:lang w:eastAsia="pt-BR"/>
+        </w:rPr>
         <w:lastRenderedPageBreak/>
         <w:drawing>
           <wp:inline distT="0" distB="0" distL="0" distR="0" wp14:anchorId="362CEACE" wp14:editId="635C682A">
@@ -206,6 +210,93 @@
       </w:r>
     </w:p>
     <w:p>
+      <w:r>
+        <w:t>Tentar cadastrar um produto usando perfil USER ao invés de ADMIN.</w:t>
+      </w:r>
+    </w:p>
+    <w:p>
+      <w:r>
+        <w:t xml:space="preserve">Usando o mesmo </w:t>
+      </w:r>
+      <w:proofErr w:type="spellStart"/>
+      <w:r>
+        <w:t>token</w:t>
+      </w:r>
+      <w:proofErr w:type="spellEnd"/>
+      <w:r>
+        <w:t xml:space="preserve"> obtido acima quando </w:t>
+      </w:r>
+      <w:proofErr w:type="spellStart"/>
+      <w:r>
+        <w:t>logou</w:t>
+      </w:r>
+      <w:proofErr w:type="spellEnd"/>
+      <w:r>
+        <w:t xml:space="preserve"> com usuário de perfil USER, tentou inserir um produto conforme ilustrado abaixo.</w:t>
+      </w:r>
+    </w:p>
+    <w:p>
+      <w:r>
+        <w:drawing>
+          <wp:inline distT="0" distB="0" distL="0" distR="0" wp14:anchorId="3151CA6A" wp14:editId="21950D9D">
+            <wp:extent cx="5400040" cy="2826498"/>
+            <wp:effectExtent l="0" t="0" r="0" b="0"/>
+            <wp:docPr id="4" name="Imagem 4"/>
+            <wp:cNvGraphicFramePr>
+              <a:graphicFrameLocks xmlns:a="http://schemas.openxmlformats.org/drawingml/2006/main" noChangeAspect="1"/>
+            </wp:cNvGraphicFramePr>
+            <a:graphic xmlns:a="http://schemas.openxmlformats.org/drawingml/2006/main">
+              <a:graphicData uri="http://schemas.openxmlformats.org/drawingml/2006/picture">
+                <pic:pic xmlns:pic="http://schemas.openxmlformats.org/drawingml/2006/picture">
+                  <pic:nvPicPr>
+                    <pic:cNvPr id="0" name=""/>
+                    <pic:cNvPicPr/>
+                  </pic:nvPicPr>
+                  <pic:blipFill>
+                    <a:blip r:embed="rId8"/>
+                    <a:stretch>
+                      <a:fillRect/>
+                    </a:stretch>
+                  </pic:blipFill>
+                  <pic:spPr>
+                    <a:xfrm>
+                      <a:off x="0" y="0"/>
+                      <a:ext cx="5400040" cy="2826498"/>
+                    </a:xfrm>
+                    <a:prstGeom prst="rect">
+                      <a:avLst/>
+                    </a:prstGeom>
+                  </pic:spPr>
+                </pic:pic>
+              </a:graphicData>
+            </a:graphic>
+          </wp:inline>
+        </w:drawing>
+      </w:r>
+    </w:p>
+    <w:p>
+      <w:r>
+        <w:t xml:space="preserve">A API retorna um status 403 </w:t>
+      </w:r>
+      <w:proofErr w:type="spellStart"/>
+      <w:r>
+        <w:t>Forbidden</w:t>
+      </w:r>
+      <w:proofErr w:type="spellEnd"/>
+      <w:r>
+        <w:t xml:space="preserve"> (Acesso Proibido), provando que a anotação @</w:t>
+      </w:r>
+      <w:proofErr w:type="spellStart"/>
+      <w:r>
+        <w:t>RolesAllowed</w:t>
+      </w:r>
+      <w:proofErr w:type="spellEnd"/>
+      <w:r>
+        <w:t>("ADMIN") está bloqueando o usuário comum de alterar o catálogo</w:t>
+      </w:r>
+      <w:r>
+        <w:t>.</w:t>
+      </w:r>
       <w:bookmarkStart w:id="0" w:name="_GoBack"/>
       <w:bookmarkEnd w:id="0"/>
     </w:p>
@@ -380,6 +471,29 @@
     <w:name w:val="Normal"/>
     <w:qFormat/>
   </w:style>
+  <w:style w:type="paragraph" w:styleId="Ttulo1">
+    <w:name w:val="heading 1"/>
+    <w:basedOn w:val="Normal"/>
+    <w:next w:val="Normal"/>
+    <w:link w:val="Ttulo1Char"/>
+    <w:uiPriority w:val="9"/>
+    <w:qFormat/>
+    <w:rsid w:val="00BD0648"/>
+    <w:pPr>
+      <w:keepNext/>
+      <w:keepLines/>
+      <w:spacing w:before="480" w:after="0"/>
+      <w:outlineLvl w:val="0"/>
+    </w:pPr>
+    <w:rPr>
+      <w:rFonts w:asciiTheme="majorHAnsi" w:eastAsiaTheme="majorEastAsia" w:hAnsiTheme="majorHAnsi" w:cstheme="majorBidi"/>
+      <w:b/>
+      <w:bCs/>
+      <w:color w:val="365F91" w:themeColor="accent1" w:themeShade="BF"/>
+      <w:sz w:val="28"/>
+      <w:szCs w:val="28"/>
+    </w:rPr>
+  </w:style>
   <w:style w:type="character" w:default="1" w:styleId="Fontepargpadro">
     <w:name w:val="Default Paragraph Font"/>
     <w:uiPriority w:val="1"/>
@@ -455,6 +569,21 @@
         <w:insideV w:val="single" w:sz="4" w:space="0" w:color="auto"/>
       </w:tblBorders>
     </w:tblPr>
+  </w:style>
+  <w:style w:type="character" w:customStyle="1" w:styleId="Ttulo1Char">
+    <w:name w:val="Título 1 Char"/>
+    <w:basedOn w:val="Fontepargpadro"/>
+    <w:link w:val="Ttulo1"/>
+    <w:uiPriority w:val="9"/>
+    <w:rsid w:val="00BD0648"/>
+    <w:rPr>
+      <w:rFonts w:asciiTheme="majorHAnsi" w:eastAsiaTheme="majorEastAsia" w:hAnsiTheme="majorHAnsi" w:cstheme="majorBidi"/>
+      <w:b/>
+      <w:bCs/>
+      <w:color w:val="365F91" w:themeColor="accent1" w:themeShade="BF"/>
+      <w:sz w:val="28"/>
+      <w:szCs w:val="28"/>
+    </w:rPr>
   </w:style>
 </w:styles>
 </file>
@@ -619,6 +748,29 @@
     <w:name w:val="Normal"/>
     <w:qFormat/>
   </w:style>
+  <w:style w:type="paragraph" w:styleId="Ttulo1">
+    <w:name w:val="heading 1"/>
+    <w:basedOn w:val="Normal"/>
+    <w:next w:val="Normal"/>
+    <w:link w:val="Ttulo1Char"/>
+    <w:uiPriority w:val="9"/>
+    <w:qFormat/>
+    <w:rsid w:val="00BD0648"/>
+    <w:pPr>
+      <w:keepNext/>
+      <w:keepLines/>
+      <w:spacing w:before="480" w:after="0"/>
+      <w:outlineLvl w:val="0"/>
+    </w:pPr>
+    <w:rPr>
+      <w:rFonts w:asciiTheme="majorHAnsi" w:eastAsiaTheme="majorEastAsia" w:hAnsiTheme="majorHAnsi" w:cstheme="majorBidi"/>
+      <w:b/>
+      <w:bCs/>
+      <w:color w:val="365F91" w:themeColor="accent1" w:themeShade="BF"/>
+      <w:sz w:val="28"/>
+      <w:szCs w:val="28"/>
+    </w:rPr>
+  </w:style>
   <w:style w:type="character" w:default="1" w:styleId="Fontepargpadro">
     <w:name w:val="Default Paragraph Font"/>
     <w:uiPriority w:val="1"/>
@@ -694,6 +846,21 @@
         <w:insideV w:val="single" w:sz="4" w:space="0" w:color="auto"/>
       </w:tblBorders>
     </w:tblPr>
+  </w:style>
+  <w:style w:type="character" w:customStyle="1" w:styleId="Ttulo1Char">
+    <w:name w:val="Título 1 Char"/>
+    <w:basedOn w:val="Fontepargpadro"/>
+    <w:link w:val="Ttulo1"/>
+    <w:uiPriority w:val="9"/>
+    <w:rsid w:val="00BD0648"/>
+    <w:rPr>
+      <w:rFonts w:asciiTheme="majorHAnsi" w:eastAsiaTheme="majorEastAsia" w:hAnsiTheme="majorHAnsi" w:cstheme="majorBidi"/>
+      <w:b/>
+      <w:bCs/>
+      <w:color w:val="365F91" w:themeColor="accent1" w:themeShade="BF"/>
+      <w:sz w:val="28"/>
+      <w:szCs w:val="28"/>
+    </w:rPr>
   </w:style>
 </w:styles>
 </file>

</xml_diff>